<commit_message>
fix: corrige Art. 37 §4º e Art. 65 I no decreto Rota B
- Art. 37 §4º: remove duplicação de 'teto anual do Programa'
- Art. 65 I: preenche lacuna com 'redirecionamento fiscal'
- limpa comentários HTML residuais do tempo do documento dual
- regera os 3 arquivos da Rota B (PDF limpo, DOCX, PDF Comentado)
- adiciona prompts de auditoria pra IAs futuras
- gitignore: ignora __pycache__ dos scripts python

Co-Authored-By: Claude Opus 4.7 (1M context) <noreply@anthropic.com>
</commit_message>
<xml_diff>
--- a/public/pdfs/Joinville - R-B - Decreto PII.docx
+++ b/public/pdfs/Joinville - R-B - Decreto PII.docx
@@ -2200,7 +2200,7 @@
         <w:rPr>
           <w:sz w:val="24"/>
         </w:rPr>
-        <w:t>Art. 16 Fica ativado e regulamentado o Fundo Municipal de Inovação Tecnológica de Joinville (FIT/Jlle), fundo contábil de natureza financeira, vinculado à Secretaria gestora (SDE), com a finalidade de concentrar e executar os recursos destinados ao Programa.</w:t>
+        <w:t>Art. 16 Fica ativado e regulamentado o Fundo Municipal de Inovação Tecnológica de Joinville (FIT/Jlle), fundo contábil de natureza financeira, vinculado à Secretaria gestora (SDE), com a finalidade de receber e administrar os saldos não executados do Programa, nos termos do art. 38.</w:t>
       </w:r>
     </w:p>
     <w:p>
@@ -2225,7 +2225,7 @@
         <w:rPr>
           <w:sz w:val="24"/>
         </w:rPr>
-        <w:t>dotações orçamentárias consignadas ao Fundo na Lei Orçamentária Anual do Município;</w:t>
+        <w:t>saldos de recursos não utilizados e devolvidos por Proponentes;</w:t>
       </w:r>
     </w:p>
     <w:p>
@@ -2237,7 +2237,7 @@
         <w:rPr>
           <w:sz w:val="24"/>
         </w:rPr>
-        <w:t>créditos adicionais e suplementações que lhe sejam destinados;</w:t>
+        <w:t>dotações orçamentárias consignadas ao Fundo na Lei Orçamentária Anual do Município;</w:t>
       </w:r>
     </w:p>
     <w:p>
@@ -2249,7 +2249,7 @@
         <w:rPr>
           <w:sz w:val="24"/>
         </w:rPr>
-        <w:t>recursos oriundos de convênios, acordos, ajustes, parcerias ou instrumentos congêneres;</w:t>
+        <w:t>créditos adicionais e suplementações que lhe sejam destinados;</w:t>
       </w:r>
     </w:p>
     <w:p>
@@ -2261,7 +2261,7 @@
         <w:rPr>
           <w:sz w:val="24"/>
         </w:rPr>
-        <w:t>doações, legados e subvenções de pessoas físicas, pessoas jurídicas ou organismos nacionais e internacionais, quando compatíveis com a finalidade do Fundo;</w:t>
+        <w:t>recursos oriundos de convênios, acordos, ajustes, parcerias ou instrumentos congêneres;</w:t>
       </w:r>
     </w:p>
     <w:p>
@@ -2273,7 +2273,7 @@
         <w:rPr>
           <w:sz w:val="24"/>
         </w:rPr>
-        <w:t>rendimentos de aplicações financeiras dos seus recursos próprios;</w:t>
+        <w:t>doações, legados e subvenções de pessoas físicas, pessoas jurídicas ou organismos nacionais e internacionais, quando compatíveis com a finalidade do Fundo;</w:t>
       </w:r>
     </w:p>
     <w:p>
@@ -2285,7 +2285,7 @@
         <w:rPr>
           <w:sz w:val="24"/>
         </w:rPr>
-        <w:t>saldos de recursos não utilizados e devolvidos por Proponentes;</w:t>
+        <w:t>rendimentos de aplicações financeiras dos seus recursos próprios;</w:t>
       </w:r>
     </w:p>
     <w:p>
@@ -4898,7 +4898,7 @@
         <w:rPr>
           <w:sz w:val="24"/>
         </w:rPr>
-        <w:t>§ 4º O teto anual do Programa o teto anual do Programa — valor máximo de redirecionamento fiscal autorizado no conjunto dos Projetos em cada exercício — será fixado pela Lei Complementar autorizativa, observada a compatibilidade com a Lei de Diretrizes Orçamentárias e a Lei Orçamentária Anual do Município, e demonstrada em nota técnica da SEFAZ (LRF, art. 14). [Decisão da PMJ — a definir na redação da LC]</w:t>
+        <w:t>§ 4º O teto anual do Programa — valor máximo de redirecionamento fiscal autorizado no conjunto dos Projetos em cada exercício — será fixado pela Lei Complementar autorizativa, observada a compatibilidade com a Lei de Diretrizes Orçamentárias e a Lei Orçamentária Anual do Município, e demonstrada em nota técnica da SEFAZ (LRF, art. 14). [Decisão da PMJ — a definir na redação da LC]</w:t>
       </w:r>
     </w:p>
     <w:p>
@@ -7789,7 +7789,7 @@
         <w:rPr>
           <w:sz w:val="24"/>
         </w:rPr>
-        <w:t>as disposições do Capítulo V relativas ao , que produzem efeitos a partir da vigência da Lei Complementar municipal autorizativa;</w:t>
+        <w:t>as disposições do Capítulo V relativas ao redirecionamento fiscal, que produzem efeitos a partir da vigência da Lei Complementar municipal autorizativa;</w:t>
       </w:r>
     </w:p>
     <w:p>

</xml_diff>